<commit_message>
docs: compte-rendu 09/07 (mise en ligne) + guide déploiement de A à Z
- Compte-rendu enrichi : URL de prod, correctifs CORS (3923fd7, b56654f), cause racine (typo .con)
- Nouveau guide complet A→Z : préparation Git, Neon, Render, FRONTEND_URL, tests, dépannage, mises à jour

Co-Authored-By: Claude Opus 4.8 <noreply@anthropic.com>
</commit_message>
<xml_diff>
--- a/Compte-Rendu-Nexus-2026-07-09.docx
+++ b/Compte-Rendu-Nexus-2026-07-09.docx
@@ -526,24 +526,191 @@
         <w:pStyle w:val="Heading1"/>
       </w:pPr>
       <w:r>
-        <w:t xml:space="preserve">5. À noter</w:t>
-      </w:r>
-    </w:p>
-    <w:p>
-      <w:pPr>
-        <w:pStyle w:val="Bullet"/>
-      </w:pPr>
-      <w:r>
-        <w:t xml:space="preserve">•  </w:t>
-      </w:r>
-      <w:r>
-        <w:rPr>
-          <w:b/>
-        </w:rPr>
-        <w:t xml:space="preserve">Prod (Render + Neon) : </w:t>
-      </w:r>
-      <w:r>
-        <w:t xml:space="preserve">relancez le seed sur la base en ligne pour que samuel@test.io y existe aussi.</w:t>
+        <w:t xml:space="preserve">5. Mise en ligne — FAIT le 09/07/2026</w:t>
+      </w:r>
+    </w:p>
+    <w:p>
+      <w:pPr>
+        <w:pStyle w:val="Body"/>
+      </w:pPr>
+      <w:r>
+        <w:t xml:space="preserve">L'application est désormais déployée et fonctionnelle en ligne.</w:t>
+      </w:r>
+    </w:p>
+    <w:p>
+      <w:pPr>
+        <w:pStyle w:val="Bullet"/>
+      </w:pPr>
+      <w:r>
+        <w:t xml:space="preserve">•  </w:t>
+      </w:r>
+      <w:r>
+        <w:rPr>
+          <w:b/>
+        </w:rPr>
+        <w:t xml:space="preserve">URL de production : </w:t>
+      </w:r>
+      <w:r>
+        <w:t xml:space="preserve">https://nexus-talent-zk0a.onrender.com</w:t>
+      </w:r>
+    </w:p>
+    <w:p>
+      <w:pPr>
+        <w:pStyle w:val="Bullet"/>
+      </w:pPr>
+      <w:r>
+        <w:t xml:space="preserve">•  </w:t>
+      </w:r>
+      <w:r>
+        <w:rPr>
+          <w:b/>
+        </w:rPr>
+        <w:t xml:space="preserve">Connexion démo : </w:t>
+      </w:r>
+      <w:r>
+        <w:t xml:space="preserve">samuel@test.io / password123 (testée, HTTP 200).</w:t>
+      </w:r>
+    </w:p>
+    <w:p>
+      <w:pPr>
+        <w:pStyle w:val="Bullet"/>
+      </w:pPr>
+      <w:r>
+        <w:t xml:space="preserve">•  </w:t>
+      </w:r>
+      <w:r>
+        <w:rPr>
+          <w:b/>
+        </w:rPr>
+        <w:t xml:space="preserve">Hébergement : </w:t>
+      </w:r>
+      <w:r>
+        <w:t xml:space="preserve">Render (serveur Node + front) + Neon (PostgreSQL). Migrations + seed appliqués au build.</w:t>
+      </w:r>
+    </w:p>
+    <w:p>
+      <w:pPr>
+        <w:pStyle w:val="Body"/>
+      </w:pPr>
+      <w:r>
+        <w:t xml:space="preserve">Correctifs apportés pendant le déploiement (commités et poussés) :</w:t>
+      </w:r>
+    </w:p>
+    <w:p>
+      <w:pPr>
+        <w:pStyle w:val="Bullet"/>
+      </w:pPr>
+      <w:r>
+        <w:t xml:space="preserve">•  </w:t>
+      </w:r>
+      <w:r>
+        <w:rPr>
+          <w:rFonts w:ascii="Consolas" w:hAnsi="Consolas"/>
+          <w:shd w:val="clear" w:fill="EEF2F7"/>
+        </w:rPr>
+        <w:t xml:space="preserve">3923fd7</w:t>
+      </w:r>
+      <w:r>
+        <w:t xml:space="preserve"> — CORS tolère FRONTEND_URL avec ou sans slash final.</w:t>
+      </w:r>
+    </w:p>
+    <w:p>
+      <w:pPr>
+        <w:pStyle w:val="Bullet"/>
+      </w:pPr>
+      <w:r>
+        <w:t xml:space="preserve">•  </w:t>
+      </w:r>
+      <w:r>
+        <w:rPr>
+          <w:rFonts w:ascii="Consolas" w:hAnsi="Consolas"/>
+          <w:shd w:val="clear" w:fill="EEF2F7"/>
+        </w:rPr>
+        <w:t xml:space="preserve">b56654f</w:t>
+      </w:r>
+      <w:r>
+        <w:t xml:space="preserve"> — CORS : normalisation agressive (trim espaces + slash + minuscules) et log de diagnostic des origines autorisées.</w:t>
+      </w:r>
+    </w:p>
+    <w:p>
+      <w:pPr>
+        <w:pStyle w:val="Body"/>
+      </w:pPr>
+      <w:r>
+        <w:rPr>
+          <w:b/>
+        </w:rPr>
+        <w:t xml:space="preserve">Cause racine du blocage de connexion : </w:t>
+      </w:r>
+      <w:r>
+        <w:t xml:space="preserve">une faute de frappe dans la variable FRONTEND_URL sur Render (.con au lieu de .com). Le log « [CORS] Origines autorisées » au démarrage permet de la repérer.</w:t>
+      </w:r>
+    </w:p>
+    <w:p>
+      <w:pPr>
+        <w:pStyle w:val="Body"/>
+      </w:pPr>
+      <w:r>
+        <w:t xml:space="preserve"/>
+      </w:r>
+    </w:p>
+    <w:p>
+      <w:pPr>
+        <w:pStyle w:val="Heading1"/>
+      </w:pPr>
+      <w:r>
+        <w:t xml:space="preserve">6. À noter</w:t>
+      </w:r>
+    </w:p>
+    <w:p>
+      <w:pPr>
+        <w:pStyle w:val="Bullet"/>
+      </w:pPr>
+      <w:r>
+        <w:t xml:space="preserve">•  </w:t>
+      </w:r>
+      <w:r>
+        <w:rPr>
+          <w:b/>
+        </w:rPr>
+        <w:t xml:space="preserve">Re-seed en prod : </w:t>
+      </w:r>
+      <w:r>
+        <w:t xml:space="preserve">si vous recréez la base, relancez le seed pour que samuel@test.io existe.</w:t>
+      </w:r>
+    </w:p>
+    <w:p>
+      <w:pPr>
+        <w:pStyle w:val="Bullet"/>
+      </w:pPr>
+      <w:r>
+        <w:t xml:space="preserve">•  </w:t>
+      </w:r>
+      <w:r>
+        <w:rPr>
+          <w:b/>
+        </w:rPr>
+        <w:t xml:space="preserve">Bouton Google grisé : </w:t>
+      </w:r>
+      <w:r>
+        <w:t xml:space="preserve">normal tant que GOOGLE_CLIENT_ID / GOOGLE_CLIENT_SECRET ne sont pas renseignés sur Render.</w:t>
+      </w:r>
+    </w:p>
+    <w:p>
+      <w:pPr>
+        <w:pStyle w:val="Bullet"/>
+      </w:pPr>
+      <w:r>
+        <w:t xml:space="preserve">•  </w:t>
+      </w:r>
+      <w:r>
+        <w:rPr>
+          <w:b/>
+        </w:rPr>
+        <w:t xml:space="preserve">Plan gratuit : </w:t>
+      </w:r>
+      <w:r>
+        <w:t xml:space="preserve">le serveur s'endort après 15 min d'inactivité (réveil ~30-60 s au 1er accès) ; photos uploadées non persistantes.</w:t>
       </w:r>
     </w:p>
     <w:p>
@@ -561,6 +728,23 @@
       </w:r>
       <w:r>
         <w:t xml:space="preserve">seule l'interface a changé. La route serveur /api/auth/sso et la config SSO_* de .env.example existent toujours (inutilisées). À supprimer plus tard si souhaité.</w:t>
+      </w:r>
+    </w:p>
+    <w:p>
+      <w:pPr>
+        <w:pStyle w:val="Bullet"/>
+      </w:pPr>
+      <w:r>
+        <w:t xml:space="preserve">•  </w:t>
+      </w:r>
+      <w:r>
+        <w:rPr>
+          <w:b/>
+        </w:rPr>
+        <w:t xml:space="preserve">Sécurité : </w:t>
+      </w:r>
+      <w:r>
+        <w:t xml:space="preserve">révoquer l'ancien token GitHub exposé (ghp_JLBr…) s'il ne l'est pas déjà.</w:t>
       </w:r>
     </w:p>
     <w:sectPr>

</xml_diff>

<commit_message>
docs: compte-rendu et guide de synchro maison enrichis des changements de sécurité
Ajout des compléments du 09/07 (données Sarah/Marc + salaires, activation Google,
navigation par rôle) et du verrouillage serveur (GET /api/users et /api/context
réservés admins/managers, fuite multi-entreprise corrigée, vérifié en prod).

Co-Authored-By: Claude Opus 4.8 <noreply@anthropic.com>
</commit_message>
<xml_diff>
--- a/Compte-Rendu-Nexus-2026-07-09.docx
+++ b/Compte-Rendu-Nexus-2026-07-09.docx
@@ -659,7 +659,179 @@
         <w:pStyle w:val="Heading1"/>
       </w:pPr>
       <w:r>
-        <w:t xml:space="preserve">6. À noter</w:t>
+        <w:t xml:space="preserve">6. Compléments du 09/07 — données, Google, permissions, sécurité</w:t>
+      </w:r>
+    </w:p>
+    <w:p>
+      <w:pPr>
+        <w:pStyle w:val="Body"/>
+      </w:pPr>
+      <w:r>
+        <w:rPr>
+          <w:b/>
+        </w:rPr>
+        <w:t xml:space="preserve">Données</w:t>
+      </w:r>
+    </w:p>
+    <w:p>
+      <w:pPr>
+        <w:pStyle w:val="Bullet"/>
+      </w:pPr>
+      <w:r>
+        <w:t xml:space="preserve">•  </w:t>
+      </w:r>
+      <w:r>
+        <w:t xml:space="preserve">Utilisateurs de démo Sarah Jenkins et Marc Antoine supprimés (local + prod).</w:t>
+      </w:r>
+    </w:p>
+    <w:p>
+      <w:pPr>
+        <w:pStyle w:val="Bullet"/>
+      </w:pPr>
+      <w:r>
+        <w:t xml:space="preserve">•  </w:t>
+      </w:r>
+      <w:r>
+        <w:t xml:space="preserve">Salaires des offres uniformisés à « 3 000 000 Ariary » (réconciliation ciblée intégrée au seed).</w:t>
+      </w:r>
+    </w:p>
+    <w:p>
+      <w:pPr>
+        <w:pStyle w:val="Body"/>
+      </w:pPr>
+      <w:r>
+        <w:rPr>
+          <w:b/>
+        </w:rPr>
+        <w:t xml:space="preserve">Connexion Google</w:t>
+      </w:r>
+    </w:p>
+    <w:p>
+      <w:pPr>
+        <w:pStyle w:val="Bullet"/>
+      </w:pPr>
+      <w:r>
+        <w:t xml:space="preserve">•  </w:t>
+      </w:r>
+      <w:r>
+        <w:t xml:space="preserve">Activée en production : variables GOOGLE_CLIENT_ID / GOOGLE_CLIENT_SECRET sur Render + URL de redirection de prod ajoutée + email autorisé (liaison de compte, pas d'auto-inscription).</w:t>
+      </w:r>
+    </w:p>
+    <w:p>
+      <w:pPr>
+        <w:pStyle w:val="Body"/>
+      </w:pPr>
+      <w:r>
+        <w:rPr>
+          <w:b/>
+        </w:rPr>
+        <w:t xml:space="preserve">Navigation par rôle</w:t>
+      </w:r>
+    </w:p>
+    <w:p>
+      <w:pPr>
+        <w:pStyle w:val="Bullet"/>
+      </w:pPr>
+      <w:r>
+        <w:t xml:space="preserve">•  </w:t>
+      </w:r>
+      <w:r>
+        <w:t xml:space="preserve">Onglets « Utilisateurs » et « Paramètres » masqués pour le rôle RH ; visibles pour Admin et Manager.</w:t>
+      </w:r>
+    </w:p>
+    <w:p>
+      <w:pPr>
+        <w:pStyle w:val="Body"/>
+      </w:pPr>
+      <w:r>
+        <w:rPr>
+          <w:b/>
+        </w:rPr>
+        <w:t xml:space="preserve">Sécurité — verrouillage côté serveur</w:t>
+      </w:r>
+    </w:p>
+    <w:p>
+      <w:pPr>
+        <w:pStyle w:val="Bullet"/>
+      </w:pPr>
+      <w:r>
+        <w:t xml:space="preserve">•  </w:t>
+      </w:r>
+      <w:r>
+        <w:rPr>
+          <w:b/>
+        </w:rPr>
+        <w:t xml:space="preserve">GET /api/users : </w:t>
+      </w:r>
+      <w:r>
+        <w:t xml:space="preserve">réservé aux admins/managers (403 pour RH) + filtre par entreprise (corrige une fuite multi-entreprise : renvoyait tous les users de toutes les sociétés).</w:t>
+      </w:r>
+    </w:p>
+    <w:p>
+      <w:pPr>
+        <w:pStyle w:val="Bullet"/>
+      </w:pPr>
+      <w:r>
+        <w:t xml:space="preserve">•  </w:t>
+      </w:r>
+      <w:r>
+        <w:rPr>
+          <w:b/>
+        </w:rPr>
+        <w:t xml:space="preserve">GET /api/context : </w:t>
+      </w:r>
+      <w:r>
+        <w:t xml:space="preserve">la liste des utilisateurs n'est exposée qu'aux rôles de gestion (RH → liste vide).</w:t>
+      </w:r>
+    </w:p>
+    <w:p>
+      <w:pPr>
+        <w:pStyle w:val="Bullet"/>
+      </w:pPr>
+      <w:r>
+        <w:t xml:space="preserve">•  </w:t>
+      </w:r>
+      <w:r>
+        <w:rPr>
+          <w:b/>
+        </w:rPr>
+        <w:t xml:space="preserve">Déjà protégé : </w:t>
+      </w:r>
+      <w:r>
+        <w:t xml:space="preserve">création d'utilisateur, paramètres société et changement de contexte (admins) ; changement de mot de passe (self-only).</w:t>
+      </w:r>
+    </w:p>
+    <w:p>
+      <w:pPr>
+        <w:pStyle w:val="Bullet"/>
+      </w:pPr>
+      <w:r>
+        <w:t xml:space="preserve">•  </w:t>
+      </w:r>
+      <w:r>
+        <w:rPr>
+          <w:b/>
+        </w:rPr>
+        <w:t xml:space="preserve">Vérifié en prod : </w:t>
+      </w:r>
+      <w:r>
+        <w:t xml:space="preserve">RH → 403, Admin → 200. Le masquage des onglets est devenu une vraie barrière serveur.</w:t>
+      </w:r>
+    </w:p>
+    <w:p>
+      <w:pPr>
+        <w:pStyle w:val="Body"/>
+      </w:pPr>
+      <w:r>
+        <w:t xml:space="preserve"/>
+      </w:r>
+    </w:p>
+    <w:p>
+      <w:pPr>
+        <w:pStyle w:val="Heading1"/>
+      </w:pPr>
+      <w:r>
+        <w:t xml:space="preserve">7. À noter</w:t>
       </w:r>
     </w:p>
     <w:p>
@@ -690,10 +862,10 @@
         <w:rPr>
           <w:b/>
         </w:rPr>
-        <w:t xml:space="preserve">Bouton Google grisé : </w:t>
-      </w:r>
-      <w:r>
-        <w:t xml:space="preserve">normal tant que GOOGLE_CLIENT_ID / GOOGLE_CLIENT_SECRET ne sont pas renseignés sur Render.</w:t>
+        <w:t xml:space="preserve">Bouton Google : </w:t>
+      </w:r>
+      <w:r>
+        <w:t xml:space="preserve">activé en prod ; il n'apparaît grisé que si GOOGLE_CLIENT_ID / GOOGLE_CLIENT_SECRET ne sont pas renseignés (ex. sur une autre installation).</w:t>
       </w:r>
     </w:p>
     <w:p>

</xml_diff>

<commit_message>
docs: compte-rendu et guide de synchro enrichis (traçabilité connexions + migration)
- Ajout de la fonctionnalité IP/navigateur + onglet Connexions.
- Correction du guide de synchro : la migration add_audit_ip_useragent doit
  désormais être appliquée en local (prisma generate + migrate deploy) ; ajout
  des nouveaux fichiers (ConnectionsView, schema, migration, App, mappers, types).

Co-Authored-By: Claude Opus 4.8 <noreply@anthropic.com>
</commit_message>
<xml_diff>
--- a/Compte-Rendu-Nexus-2026-07-09.docx
+++ b/Compte-Rendu-Nexus-2026-07-09.docx
@@ -816,6 +816,61 @@
       </w:r>
       <w:r>
         <w:t xml:space="preserve">RH → 403, Admin → 200. Le masquage des onglets est devenu une vraie barrière serveur.</w:t>
+      </w:r>
+    </w:p>
+    <w:p>
+      <w:pPr>
+        <w:pStyle w:val="Body"/>
+      </w:pPr>
+      <w:r>
+        <w:rPr>
+          <w:b/>
+        </w:rPr>
+        <w:t xml:space="preserve">Traçabilité des connexions (IP + navigateur)</w:t>
+      </w:r>
+    </w:p>
+    <w:p>
+      <w:pPr>
+        <w:pStyle w:val="Bullet"/>
+      </w:pPr>
+      <w:r>
+        <w:t xml:space="preserve">•  </w:t>
+      </w:r>
+      <w:r>
+        <w:t xml:space="preserve">Chaque connexion (mot de passe + Google/SSO) enregistre désormais l'IP réelle du visiteur (via Cloudflare) et le navigateur — nouveaux champs AuditLog + migration add_audit_ip_useragent.</w:t>
+      </w:r>
+    </w:p>
+    <w:p>
+      <w:pPr>
+        <w:pStyle w:val="Bullet"/>
+      </w:pPr>
+      <w:r>
+        <w:t xml:space="preserve">•  </w:t>
+      </w:r>
+      <w:r>
+        <w:t xml:space="preserve">Nouvel onglet « Connexions » : table Utilisateur / Rôle / IP / Navigateur / Date, avec recherche.</w:t>
+      </w:r>
+    </w:p>
+    <w:p>
+      <w:pPr>
+        <w:pStyle w:val="Bullet"/>
+      </w:pPr>
+      <w:r>
+        <w:t xml:space="preserve">•  </w:t>
+      </w:r>
+      <w:r>
+        <w:t xml:space="preserve">Réservé aux Admins entreprise/plateforme ; l'IP et le navigateur sont masqués côté API pour les autres rôles (RH, Manager).</w:t>
+      </w:r>
+    </w:p>
+    <w:p>
+      <w:pPr>
+        <w:pStyle w:val="Bullet"/>
+      </w:pPr>
+      <w:r>
+        <w:t xml:space="preserve">•  </w:t>
+      </w:r>
+      <w:r>
+        <w:t xml:space="preserve">Vérifié en prod : Admin voit l'IP, RH non. Les connexions antérieures à aujourd'hui n'ont pas d'IP.</w:t>
       </w:r>
     </w:p>
     <w:p>

</xml_diff>